<commit_message>
Add the repository link to the report
Fill the Section 11 placeholder with
https://github.com/zjsyxzjsyx/DASE7506-MP2 and re-export the PDF
(still 9 pages). Report files only; the submitted code and checkpoint
remain commit b3a1d38.

Co-Authored-By: Claude Opus 5.5 <noreply@anthropic.com>
</commit_message>
<xml_diff>
--- a/report/MP2 Report.docx
+++ b/report/MP2 Report.docx
@@ -6452,8 +6452,17 @@
               <w:rPr>
                 <w:sz w:val="19"/>
               </w:rPr>
-              <w:t>[repository link to be added]</w:t>
-            </w:r>
+            </w:r>
+            <w:hyperlink r:id="rId11">
+              <w:r>
+                <w:rPr>
+                  <w:sz w:val="19"/>
+                  <w:color w:val="0563C1"/>
+                  <w:u w:val="single"/>
+                </w:rPr>
+                <w:t>https://github.com/zjsyxzjsyx/DASE7506-MP2</w:t>
+              </w:r>
+            </w:hyperlink>
           </w:p>
         </w:tc>
       </w:tr>

</xml_diff>